<commit_message>
deploy(server): elevator-api live on port 3610 behind /elevator-api/
Deployed and verified in production:
- PM2 'elevator-api' online, pm2 save'd (survives reboot)
- nginx: new location only, existing blocks untouched; full-site regression
  checked across 11 paths, all normal
- Kill -9 the process: PM2 recovers in ~4s, data survives (PR-BE-1 acceptance)
- Public archive round-trip verified over HTTPS

Two corrections from reality, both documented:
- Port 3600 was WRONG — reserved by airport-twin's backend in nginx even while its
  process was down. My first survey was truncated by head(1). Moved to 3610 and
  added the lesson: check nginx proxy_pass targets, not just current listeners.
- $connection_upgrade is undefined on this host (no map directive); the first
  nginx -t failed and auto-rolled back with zero downtime. REST and WS are now
  split into separate locations per the site's existing airport-twin convention.

Co-Authored-By: Claude Fable 5 <noreply@anthropic.com>
</commit_message>
<xml_diff>
--- a/docs/电梯数字孪生-后台服务规划-v1.0-20260724.docx
+++ b/docs/电梯数字孪生-后台服务规划-v1.0-20260724.docx
@@ -1127,7 +1127,17 @@
           </w:tcPr>
           <w:p>
             <w:r>
-              <w:t xml:space="preserve">3001、3100、3300、3400、3500、3721、5555、8080、443、22</w:t>
+              <w:t xml:space="preserve">3001、3100、3300、3400、3500、</w:t>
+            </w:r>
+            <w:r>
+              <w:rPr>
+                <w:b/>
+                <w:bCs/>
+              </w:rPr>
+              <w:t xml:space="preserve">3600</w:t>
+            </w:r>
+            <w:r>
+              <w:t xml:space="preserve">、3721、5555、8080、443、22</w:t>
             </w:r>
           </w:p>
         </w:tc>
@@ -1184,10 +1194,76 @@
                 <w:b/>
                 <w:bCs/>
               </w:rPr>
-              <w:t xml:space="preserve">3600</w:t>
-            </w:r>
-            <w:r>
-              <w:t xml:space="preserve">（本规划选定）</w:t>
+              <w:t xml:space="preserve">3610</w:t>
+            </w:r>
+            <w:r>
+              <w:t xml:space="preserve">（本规划选定，2026-07-31 部署实测）</w:t>
+            </w:r>
+          </w:p>
+        </w:tc>
+      </w:tr>
+      <w:tr>
+        <w:trPr>
+          <w:tblHeader w:val="false"/>
+        </w:trPr>
+        <w:tc>
+          <w:tcPr>
+            <w:tcW w:type="dxa" w:w="977"/>
+            <w:tcBorders>
+              <w:top w:val="single" w:color="BBBBBB" w:sz="1"/>
+              <w:left w:val="single" w:color="BBBBBB" w:sz="1"/>
+              <w:bottom w:val="single" w:color="BBBBBB" w:sz="1"/>
+              <w:right w:val="single" w:color="BBBBBB" w:sz="1"/>
+            </w:tcBorders>
+            <w:tcMar>
+              <w:top w:type="dxa" w:w="60"/>
+              <w:left w:type="dxa" w:w="100"/>
+              <w:bottom w:type="dxa" w:w="60"/>
+              <w:right w:type="dxa" w:w="100"/>
+            </w:tcMar>
+          </w:tcPr>
+          <w:p>
+            <w:r>
+              <w:t xml:space="preserve">⚠ 端口勘误</w:t>
+            </w:r>
+          </w:p>
+        </w:tc>
+        <w:tc>
+          <w:tcPr>
+            <w:tcW w:type="dxa" w:w="8383"/>
+            <w:tcBorders>
+              <w:top w:val="single" w:color="BBBBBB" w:sz="1"/>
+              <w:left w:val="single" w:color="BBBBBB" w:sz="1"/>
+              <w:bottom w:val="single" w:color="BBBBBB" w:sz="1"/>
+              <w:right w:val="single" w:color="BBBBBB" w:sz="1"/>
+            </w:tcBorders>
+            <w:tcMar>
+              <w:top w:type="dxa" w:w="60"/>
+              <w:left w:type="dxa" w:w="100"/>
+              <w:bottom w:type="dxa" w:w="60"/>
+              <w:right w:type="dxa" w:w="100"/>
+            </w:tcMar>
+          </w:tcPr>
+          <w:p>
+            <w:r>
+              <w:t xml:space="preserve">初稿曾定 3600，实为 </w:t>
+            </w:r>
+            <w:r>
+              <w:rPr>
+                <w:b/>
+                <w:bCs/>
+              </w:rPr>
+              <w:t xml:space="preserve">airport-twin 后台</w:t>
+            </w:r>
+            <w:r>
+              <w:t xml:space="preserve">占用（`/airport-twin/api/` 反代目标）。首次扫描因 `head` 截断漏看，后经"nginx 全量 proxy_pass 目标 + 实际监听"双重排查纠正。</w:t>
+            </w:r>
+            <w:r>
+              <w:rPr>
+                <w:b/>
+                <w:bCs/>
+              </w:rPr>
+              <w:t xml:space="preserve">教训：端口占用必须查 nginx 引用，不能只看当前监听——进程停着时端口仍是被预留的</w:t>
             </w:r>
           </w:p>
         </w:tc>
@@ -7440,7 +7516,7 @@
         <w:pStyle w:val="Heading2"/>
       </w:pPr>
       <w:r>
-        <w:t xml:space="preserve">附录 B 部署清单（实测命令模板）</w:t>
+        <w:t xml:space="preserve">附录 B 部署清单（2026-07-31 已按此实际执行）</w:t>
       </w:r>
     </w:p>
     <w:p/>
@@ -7475,7 +7551,7 @@
         </w:numPr>
       </w:pPr>
       <w:r>
-        <w:t xml:space="preserve">PM2 启动：`pm2 start server.js --name elevator-api` 后 `pm2 save`</w:t>
+        <w:t xml:space="preserve">PM2：`ELV_PORT=3610 pm2 start server.js --name elevator-api --update-env` → `pm2 save`（抗重启）</w:t>
       </w:r>
     </w:p>
     <w:p>
@@ -7487,7 +7563,7 @@
         </w:numPr>
       </w:pPr>
       <w:r>
-        <w:t xml:space="preserve">nginx：备份 `battleai` 配置 → 新增 `location /elevator-api/ { proxy_pass http://127.0.0.1:3600/; }`（含 WS 需 `proxy_set_header Upgrade`）→ `sudo nginx -t` → `reload`</w:t>
+        <w:t xml:space="preserve">nginx：备份 `battleai` → 在 `/elevator-twin/` 块后新增 `location /elevator-api/ { proxy_pass http://127.0.0.1:3610/; }` + Host/X-Forwarded-For 头 → `nginx -t` → `systemctl reload nginx`</w:t>
       </w:r>
     </w:p>
     <w:p>
@@ -7499,7 +7575,17 @@
         </w:numPr>
       </w:pPr>
       <w:r>
-        <w:t xml:space="preserve">验证：`curl https://opcstudio.cc/elevator-api/health` 返回 200 且 ver 与部署一致</w:t>
+        <w:t xml:space="preserve">验证：`curl https://opcstudio.cc/elevator-api/health` 200；</w:t>
+      </w:r>
+      <w:r>
+        <w:rPr>
+          <w:b/>
+          <w:bCs/>
+        </w:rPr>
+        <w:t xml:space="preserve">并逐一回归全站其余 location</w:t>
+      </w:r>
+      <w:r>
+        <w:t xml:space="preserve">（本次实测 11 个路径全部正常）</w:t>
       </w:r>
     </w:p>
     <w:p>
@@ -7512,6 +7598,42 @@
       </w:pPr>
       <w:r>
         <w:t xml:space="preserve">回滚：`pm2 stop elevator-api` + 恢复 nginx 备份 —— 前端应仍完全可用（P-1 回归项）</w:t>
+      </w:r>
+    </w:p>
+    <w:p/>
+    <w:p>
+      <w:r>
+        <w:rPr>
+          <w:b/>
+          <w:bCs/>
+        </w:rPr>
+        <w:t xml:space="preserve">踩坑记录（供 PR-BE-6 WebSocket 阶段参考）</w:t>
+      </w:r>
+      <w:r>
+        <w:t xml:space="preserve">：本机 nginx </w:t>
+      </w:r>
+      <w:r>
+        <w:rPr>
+          <w:b/>
+          <w:bCs/>
+        </w:rPr>
+        <w:t xml:space="preserve">未定义 `$connection_upgrade` 变量</w:t>
+      </w:r>
+      <w:r>
+        <w:t xml:space="preserve">（缺 http 块的 `map` 指令），首次插入含该变量的配置直接 `nginx -t` 失败。已按站内既有范式改为 REST 与 WS 分设 location（参照 `/airport-twin/api/` 与 `/airport-twin/feed`）。将来做遥测桥时，要么在 http 块补 `map $http_upgrade $connection_upgrade {...}`，要么照 airport-twin 用字面量 `proxy_set_header Connection "upgrade";`。</w:t>
+      </w:r>
+    </w:p>
+    <w:p/>
+    <w:p>
+      <w:r>
+        <w:rPr>
+          <w:b/>
+          <w:bCs/>
+        </w:rPr>
+        <w:t xml:space="preserve">部署脚本务必自带校验与回滚</w:t>
+      </w:r>
+      <w:r>
+        <w:t xml:space="preserve">：本次正因"改完先 `nginx -t`，失败自动 `cp` 回备份"，配置错误未造成任何停机。</w:t>
       </w:r>
     </w:p>
     <w:p/>

</xml_diff>